<commit_message>
Add Chenouard metrics, 6D benchmarks, and cost-function updates
- chenouardMetrics.m: Munkres + dummy-extension implementation (paper-faithful)
- orientationErrorPerTrack.m, test_chenouard_v2.m analysis helpers
- benchmark6D* suite (density/blink, MC, sweeps) and fig3 plot drafts
- costMat6DSMOLMLink/CloseGaps updates
- Move angularDistance.m out of helpers/ (now in cost_functions/)
- Add .gitignore for session data, backups, logs, and regenerable outputs

Co-Authored-By: Claude Opus 4.8 <noreply@anthropic.com>
</commit_message>
<xml_diff>
--- a/software6D/docs/6DSMOLM_tracking_methods.docx
+++ b/software6D/docs/6DSMOLM_tracking_methods.docx
@@ -327,23 +327,7 @@
           <w:rFonts w:ascii="Times New Roman" w:eastAsiaTheme="minorEastAsia" w:hAnsi="Times New Roman" w:cs="Times New Roman"/>
           <w:color w:val="000000"/>
         </w:rPr>
-        <w:t xml:space="preserve"> serves a dual role: it contributes an optional independent cost term and modulates the measure</w:t>
-      </w:r>
-      <w:proofErr w:type="spellStart"/>
-      <w:r>
-        <w:rPr>
-          <w:rFonts w:ascii="Times New Roman" w:eastAsiaTheme="minorEastAsia" w:hAnsi="Times New Roman" w:cs="Times New Roman"/>
-          <w:color w:val="000000"/>
-        </w:rPr>
-        <w:t>ment</w:t>
-      </w:r>
-      <w:proofErr w:type="spellEnd"/>
-      <w:r>
-        <w:rPr>
-          <w:rFonts w:ascii="Times New Roman" w:eastAsiaTheme="minorEastAsia" w:hAnsi="Times New Roman" w:cs="Times New Roman"/>
-          <w:color w:val="000000"/>
-        </w:rPr>
-        <w:t xml:space="preserve"> noise assigned to </w:t>
+        <w:t xml:space="preserve"> serves a dual role: it contributes an optional independent cost term and modulates the measurement noise assigned to </w:t>
       </w:r>
       <m:oMath>
         <m:r>
@@ -2474,7 +2458,23 @@
           <w:rFonts w:ascii="Times New Roman" w:eastAsiaTheme="minorEastAsia" w:hAnsi="Times New Roman" w:cs="Times New Roman"/>
           <w:color w:val="000000"/>
         </w:rPr>
-        <w:t xml:space="preserve">, the gain is large and the filter trusts the measurement. When </w:t>
+        <w:t xml:space="preserve">, the gain is </w:t>
+      </w:r>
+      <w:proofErr w:type="gramStart"/>
+      <w:r>
+        <w:rPr>
+          <w:rFonts w:ascii="Times New Roman" w:eastAsiaTheme="minorEastAsia" w:hAnsi="Times New Roman" w:cs="Times New Roman"/>
+          <w:color w:val="000000"/>
+        </w:rPr>
+        <w:t>large</w:t>
+      </w:r>
+      <w:proofErr w:type="gramEnd"/>
+      <w:r>
+        <w:rPr>
+          <w:rFonts w:ascii="Times New Roman" w:eastAsiaTheme="minorEastAsia" w:hAnsi="Times New Roman" w:cs="Times New Roman"/>
+          <w:color w:val="000000"/>
+        </w:rPr>
+        <w:t xml:space="preserve"> and the filter trusts the measurement. When </w:t>
       </w:r>
       <m:oMath>
         <m:r>
@@ -2506,7 +2506,23 @@
           <w:rFonts w:ascii="Times New Roman" w:eastAsiaTheme="minorEastAsia" w:hAnsi="Times New Roman" w:cs="Times New Roman"/>
           <w:color w:val="000000"/>
         </w:rPr>
-        <w:t>, the gain is small and the filter trusts its prediction.</w:t>
+        <w:t xml:space="preserve">, the gain is </w:t>
+      </w:r>
+      <w:proofErr w:type="gramStart"/>
+      <w:r>
+        <w:rPr>
+          <w:rFonts w:ascii="Times New Roman" w:eastAsiaTheme="minorEastAsia" w:hAnsi="Times New Roman" w:cs="Times New Roman"/>
+          <w:color w:val="000000"/>
+        </w:rPr>
+        <w:t>small</w:t>
+      </w:r>
+      <w:proofErr w:type="gramEnd"/>
+      <w:r>
+        <w:rPr>
+          <w:rFonts w:ascii="Times New Roman" w:eastAsiaTheme="minorEastAsia" w:hAnsi="Times New Roman" w:cs="Times New Roman"/>
+          <w:color w:val="000000"/>
+        </w:rPr>
+        <w:t xml:space="preserve"> and the filter trusts its prediction.</w:t>
       </w:r>
     </w:p>
     <w:p>
@@ -2917,7 +2933,23 @@
           <w:rFonts w:ascii="Times New Roman" w:eastAsiaTheme="minorEastAsia" w:hAnsi="Times New Roman" w:cs="Times New Roman"/>
           <w:color w:val="000000"/>
         </w:rPr>
-        <w:t>, multiplied by a user-specified factor (brownStdMult, default: 3). The search radius may be expanded based on local particle density, but is clamped between user-specified minimum and maximum values. Track-detection pairs whose distance exceeds the search radius are excluded from the cost matrix by setting their cost to infinity (nonlinkMarker) [1]. The remaining valid entries are then solved by the Jonker-Volgenant algorithm [7] to obtain the globally optimal frame-to-frame assignment.</w:t>
+        <w:t xml:space="preserve">, multiplied by a user-specified factor (brownStdMult, default: 3). The search radius may be expanded based on local particle </w:t>
+      </w:r>
+      <w:proofErr w:type="gramStart"/>
+      <w:r>
+        <w:rPr>
+          <w:rFonts w:ascii="Times New Roman" w:eastAsiaTheme="minorEastAsia" w:hAnsi="Times New Roman" w:cs="Times New Roman"/>
+          <w:color w:val="000000"/>
+        </w:rPr>
+        <w:t>density, but</w:t>
+      </w:r>
+      <w:proofErr w:type="gramEnd"/>
+      <w:r>
+        <w:rPr>
+          <w:rFonts w:ascii="Times New Roman" w:eastAsiaTheme="minorEastAsia" w:hAnsi="Times New Roman" w:cs="Times New Roman"/>
+          <w:color w:val="000000"/>
+        </w:rPr>
+        <w:t xml:space="preserve"> is clamped between user-specified minimum and maximum values. Track-detection pairs whose distance exceeds the search radius are excluded from the cost matrix by setting their cost to infinity (nonlinkMarker) [1]. The remaining valid entries are then solved by the Jonker-Volgenant algorithm [7] to obtain the globally optimal frame-to-frame assignment.</w:t>
       </w:r>
     </w:p>
     <w:p>
@@ -3122,7 +3154,27 @@
           <w:color w:val="808080"/>
           <w:sz w:val="16"/>
         </w:rPr>
-        <w:t>DSMOLMLink.m:611  |  generate6DTrajectories.m:367-368</w:t>
+        <w:t>DSMOLMLink.m:</w:t>
+      </w:r>
+      <w:proofErr w:type="gramStart"/>
+      <w:r>
+        <w:rPr>
+          <w:rFonts w:ascii="Consolas" w:hAnsi="Consolas"/>
+          <w:i/>
+          <w:color w:val="808080"/>
+          <w:sz w:val="16"/>
+        </w:rPr>
+        <w:t>611  |</w:t>
+      </w:r>
+      <w:proofErr w:type="gramEnd"/>
+      <w:r>
+        <w:rPr>
+          <w:rFonts w:ascii="Consolas" w:hAnsi="Consolas"/>
+          <w:i/>
+          <w:color w:val="808080"/>
+          <w:sz w:val="16"/>
+        </w:rPr>
+        <w:t xml:space="preserve">  generate6DTrajectories.m:367-368</w:t>
       </w:r>
     </w:p>
     <w:p>
@@ -3315,9 +3367,20 @@
           <w:color w:val="808080"/>
           <w:sz w:val="16"/>
         </w:rPr>
-        <w:t>Code: costMat6DSMOLMLink.m:624-625  (</w:t>
+        <w:t>Code: costMat6DSMOLMLink.m:624-</w:t>
+      </w:r>
+      <w:proofErr w:type="gramStart"/>
+      <w:r>
+        <w:rPr>
+          <w:rFonts w:ascii="Consolas" w:hAnsi="Consolas"/>
+          <w:i/>
+          <w:color w:val="808080"/>
+          <w:sz w:val="16"/>
+        </w:rPr>
+        <w:t>625  (</w:t>
       </w:r>
       <w:proofErr w:type="spellStart"/>
+      <w:proofErr w:type="gramEnd"/>
       <w:r>
         <w:rPr>
           <w:rFonts w:ascii="Consolas" w:hAnsi="Consolas"/>
@@ -3766,7 +3829,27 @@
           <w:color w:val="808080"/>
           <w:sz w:val="16"/>
         </w:rPr>
-        <w:t>Code: costMat6DSMOLMLink.m:426,429  |  generate6DTrajectories.m:619,632</w:t>
+        <w:t>Code: costMat6DSMOLMLink.m:</w:t>
+      </w:r>
+      <w:proofErr w:type="gramStart"/>
+      <w:r>
+        <w:rPr>
+          <w:rFonts w:ascii="Consolas" w:hAnsi="Consolas"/>
+          <w:i/>
+          <w:color w:val="808080"/>
+          <w:sz w:val="16"/>
+        </w:rPr>
+        <w:t>426,429  |</w:t>
+      </w:r>
+      <w:proofErr w:type="gramEnd"/>
+      <w:r>
+        <w:rPr>
+          <w:rFonts w:ascii="Consolas" w:hAnsi="Consolas"/>
+          <w:i/>
+          <w:color w:val="808080"/>
+          <w:sz w:val="16"/>
+        </w:rPr>
+        <w:t xml:space="preserve">  generate6DTrajectories.m:619,632</w:t>
       </w:r>
     </w:p>
     <w:p>
@@ -4130,7 +4213,23 @@
           <w:rFonts w:ascii="Times New Roman" w:eastAsiaTheme="minorEastAsia" w:hAnsi="Times New Roman" w:cs="Times New Roman"/>
           <w:color w:val="000000"/>
         </w:rPr>
-        <w:t xml:space="preserve"> about the learned angular-velocity axis, or leave it unchanged.</w:t>
+        <w:t xml:space="preserve"> about the learned </w:t>
+      </w:r>
+      <w:proofErr w:type="gramStart"/>
+      <w:r>
+        <w:rPr>
+          <w:rFonts w:ascii="Times New Roman" w:eastAsiaTheme="minorEastAsia" w:hAnsi="Times New Roman" w:cs="Times New Roman"/>
+          <w:color w:val="000000"/>
+        </w:rPr>
+        <w:t>angular-velocity</w:t>
+      </w:r>
+      <w:proofErr w:type="gramEnd"/>
+      <w:r>
+        <w:rPr>
+          <w:rFonts w:ascii="Times New Roman" w:eastAsiaTheme="minorEastAsia" w:hAnsi="Times New Roman" w:cs="Times New Roman"/>
+          <w:color w:val="000000"/>
+        </w:rPr>
+        <w:t xml:space="preserve"> axis, or leave it unchanged.</w:t>
       </w:r>
     </w:p>
     <w:p>
@@ -5522,9 +5621,9 @@
           <w:color w:val="808080"/>
           <w:sz w:val="16"/>
         </w:rPr>
-        <w:t>stMat6DSMOLMLink.m:738-740  (</w:t>
-      </w:r>
-      <w:proofErr w:type="spellStart"/>
+        <w:t>stMat6DSMOLMLink.m:738-</w:t>
+      </w:r>
+      <w:proofErr w:type="gramStart"/>
       <w:r>
         <w:rPr>
           <w:rFonts w:ascii="Consolas" w:hAnsi="Consolas"/>
@@ -5532,9 +5631,10 @@
           <w:color w:val="808080"/>
           <w:sz w:val="16"/>
         </w:rPr>
-        <w:t>rotateVector</w:t>
-      </w:r>
-      <w:proofErr w:type="spellEnd"/>
+        <w:t>740  (</w:t>
+      </w:r>
+      <w:proofErr w:type="spellStart"/>
+      <w:proofErr w:type="gramEnd"/>
       <w:r>
         <w:rPr>
           <w:rFonts w:ascii="Consolas" w:hAnsi="Consolas"/>
@@ -5542,7 +5642,37 @@
           <w:color w:val="808080"/>
           <w:sz w:val="16"/>
         </w:rPr>
-        <w:t>)  |  generate6DTrajectories.m:700-702  (rodrigues_rotate)</w:t>
+        <w:t>rotateVector</w:t>
+      </w:r>
+      <w:proofErr w:type="spellEnd"/>
+      <w:r>
+        <w:rPr>
+          <w:rFonts w:ascii="Consolas" w:hAnsi="Consolas"/>
+          <w:i/>
+          <w:color w:val="808080"/>
+          <w:sz w:val="16"/>
+        </w:rPr>
+        <w:t>)  |  generate6DTrajectories.m:700-702  (</w:t>
+      </w:r>
+      <w:proofErr w:type="spellStart"/>
+      <w:r>
+        <w:rPr>
+          <w:rFonts w:ascii="Consolas" w:hAnsi="Consolas"/>
+          <w:i/>
+          <w:color w:val="808080"/>
+          <w:sz w:val="16"/>
+        </w:rPr>
+        <w:t>rodrigues_rotate</w:t>
+      </w:r>
+      <w:proofErr w:type="spellEnd"/>
+      <w:r>
+        <w:rPr>
+          <w:rFonts w:ascii="Consolas" w:hAnsi="Consolas"/>
+          <w:i/>
+          <w:color w:val="808080"/>
+          <w:sz w:val="16"/>
+        </w:rPr>
+        <w:t>)</w:t>
       </w:r>
     </w:p>
     <w:p>
@@ -8519,7 +8649,27 @@
           <w:color w:val="808080"/>
           <w:sz w:val="16"/>
         </w:rPr>
-        <w:t xml:space="preserve">Code: costMat6DSMOLMLink.m:472-473  (min over </w:t>
+        <w:t>Code: costMat6DSMOLMLink.m:472-</w:t>
+      </w:r>
+      <w:proofErr w:type="gramStart"/>
+      <w:r>
+        <w:rPr>
+          <w:rFonts w:ascii="Consolas" w:hAnsi="Consolas"/>
+          <w:i/>
+          <w:color w:val="808080"/>
+          <w:sz w:val="16"/>
+        </w:rPr>
+        <w:t>473  (</w:t>
+      </w:r>
+      <w:proofErr w:type="gramEnd"/>
+      <w:r>
+        <w:rPr>
+          <w:rFonts w:ascii="Consolas" w:hAnsi="Consolas"/>
+          <w:i/>
+          <w:color w:val="808080"/>
+          <w:sz w:val="16"/>
+        </w:rPr>
+        <w:t xml:space="preserve">min over </w:t>
       </w:r>
       <w:proofErr w:type="spellStart"/>
       <w:r>
@@ -9409,9 +9559,9 @@
           <w:color w:val="808080"/>
           <w:sz w:val="16"/>
         </w:rPr>
-        <w:t>lap.m</w:t>
-      </w:r>
-      <w:proofErr w:type="spellEnd"/>
+        <w:t>lap.</w:t>
+      </w:r>
+      <w:proofErr w:type="gramStart"/>
       <w:r>
         <w:rPr>
           <w:rFonts w:ascii="Consolas" w:hAnsi="Consolas"/>
@@ -9419,7 +9569,27 @@
           <w:color w:val="808080"/>
           <w:sz w:val="16"/>
         </w:rPr>
-        <w:t xml:space="preserve">  (Jonker-</w:t>
+        <w:t>m</w:t>
+      </w:r>
+      <w:proofErr w:type="spellEnd"/>
+      <w:r>
+        <w:rPr>
+          <w:rFonts w:ascii="Consolas" w:hAnsi="Consolas"/>
+          <w:i/>
+          <w:color w:val="808080"/>
+          <w:sz w:val="16"/>
+        </w:rPr>
+        <w:t xml:space="preserve">  (</w:t>
+      </w:r>
+      <w:proofErr w:type="gramEnd"/>
+      <w:r>
+        <w:rPr>
+          <w:rFonts w:ascii="Consolas" w:hAnsi="Consolas"/>
+          <w:i/>
+          <w:color w:val="808080"/>
+          <w:sz w:val="16"/>
+        </w:rPr>
+        <w:t>Jonker-</w:t>
       </w:r>
       <w:proofErr w:type="spellStart"/>
       <w:r>
@@ -10427,7 +10597,27 @@
           <w:color w:val="808080"/>
           <w:sz w:val="16"/>
         </w:rPr>
-        <w:t xml:space="preserve">Code: generate6DTrajectories.m:279  (if rand &lt; </w:t>
+        <w:t>Code: generate6DTrajectories.m:</w:t>
+      </w:r>
+      <w:proofErr w:type="gramStart"/>
+      <w:r>
+        <w:rPr>
+          <w:rFonts w:ascii="Consolas" w:hAnsi="Consolas"/>
+          <w:i/>
+          <w:color w:val="808080"/>
+          <w:sz w:val="16"/>
+        </w:rPr>
+        <w:t>279  (</w:t>
+      </w:r>
+      <w:proofErr w:type="gramEnd"/>
+      <w:r>
+        <w:rPr>
+          <w:rFonts w:ascii="Consolas" w:hAnsi="Consolas"/>
+          <w:i/>
+          <w:color w:val="808080"/>
+          <w:sz w:val="16"/>
+        </w:rPr>
+        <w:t xml:space="preserve">if rand &lt; </w:t>
       </w:r>
       <w:proofErr w:type="spellStart"/>
       <w:r>
@@ -10555,7 +10745,27 @@
           <w:color w:val="808080"/>
           <w:sz w:val="16"/>
         </w:rPr>
-        <w:t xml:space="preserve">Code: generate6DTrajectories.m:283  (if rand &lt; </w:t>
+        <w:t>Code: generate6DTrajectories.m:</w:t>
+      </w:r>
+      <w:proofErr w:type="gramStart"/>
+      <w:r>
+        <w:rPr>
+          <w:rFonts w:ascii="Consolas" w:hAnsi="Consolas"/>
+          <w:i/>
+          <w:color w:val="808080"/>
+          <w:sz w:val="16"/>
+        </w:rPr>
+        <w:t>283  (</w:t>
+      </w:r>
+      <w:proofErr w:type="gramEnd"/>
+      <w:r>
+        <w:rPr>
+          <w:rFonts w:ascii="Consolas" w:hAnsi="Consolas"/>
+          <w:i/>
+          <w:color w:val="808080"/>
+          <w:sz w:val="16"/>
+        </w:rPr>
+        <w:t xml:space="preserve">if rand &lt; </w:t>
       </w:r>
       <w:proofErr w:type="spellStart"/>
       <w:r>
@@ -10683,7 +10893,27 @@
           <w:color w:val="808080"/>
           <w:sz w:val="16"/>
         </w:rPr>
-        <w:t xml:space="preserve">Code: generate6DTrajectories.m:272  (if rand &lt; </w:t>
+        <w:t>Code: generate6DTrajectories.m:</w:t>
+      </w:r>
+      <w:proofErr w:type="gramStart"/>
+      <w:r>
+        <w:rPr>
+          <w:rFonts w:ascii="Consolas" w:hAnsi="Consolas"/>
+          <w:i/>
+          <w:color w:val="808080"/>
+          <w:sz w:val="16"/>
+        </w:rPr>
+        <w:t>272  (</w:t>
+      </w:r>
+      <w:proofErr w:type="gramEnd"/>
+      <w:r>
+        <w:rPr>
+          <w:rFonts w:ascii="Consolas" w:hAnsi="Consolas"/>
+          <w:i/>
+          <w:color w:val="808080"/>
+          <w:sz w:val="16"/>
+        </w:rPr>
+        <w:t xml:space="preserve">if rand &lt; </w:t>
       </w:r>
       <w:proofErr w:type="spellStart"/>
       <w:r>
@@ -11157,9 +11387,20 @@
           <w:color w:val="808080"/>
           <w:sz w:val="16"/>
         </w:rPr>
-        <w:t>Code: generate6DTrajectories.m:435-436  (</w:t>
+        <w:t>Code: generate6DTrajectories.m:435-</w:t>
+      </w:r>
+      <w:proofErr w:type="gramStart"/>
+      <w:r>
+        <w:rPr>
+          <w:rFonts w:ascii="Consolas" w:hAnsi="Consolas"/>
+          <w:i/>
+          <w:color w:val="808080"/>
+          <w:sz w:val="16"/>
+        </w:rPr>
+        <w:t>436  (</w:t>
       </w:r>
       <w:proofErr w:type="spellStart"/>
+      <w:proofErr w:type="gramEnd"/>
       <w:r>
         <w:rPr>
           <w:rFonts w:ascii="Consolas" w:hAnsi="Consolas"/>
@@ -11305,9 +11546,20 @@
           <w:color w:val="808080"/>
           <w:sz w:val="16"/>
         </w:rPr>
-        <w:t>Code: generate6DTrajectories.m:438  (</w:t>
+        <w:t>Code: generate6DTrajectories.m:</w:t>
+      </w:r>
+      <w:proofErr w:type="gramStart"/>
+      <w:r>
+        <w:rPr>
+          <w:rFonts w:ascii="Consolas" w:hAnsi="Consolas"/>
+          <w:i/>
+          <w:color w:val="808080"/>
+          <w:sz w:val="16"/>
+        </w:rPr>
+        <w:t>438  (</w:t>
       </w:r>
       <w:proofErr w:type="spellStart"/>
+      <w:proofErr w:type="gramEnd"/>
       <w:r>
         <w:rPr>
           <w:rFonts w:ascii="Consolas" w:hAnsi="Consolas"/>
@@ -11749,7 +12001,23 @@
           <w:rFonts w:ascii="Times New Roman" w:eastAsiaTheme="minorEastAsia" w:hAnsi="Times New Roman" w:cs="Times New Roman"/>
           <w:color w:val="000000"/>
         </w:rPr>
-        <w:t xml:space="preserve"> [4]. The simulator does not enforce this relationship; the signal photon count and localization noise are independent user inputs. We evaluate tracking performance across a range of localization precisions, corresponding to experimental conditions spanning low to high signal-to-noise ratio:</w:t>
+        <w:t xml:space="preserve"> [4]. The simulator does not enforce this relationship; the signal photon </w:t>
+      </w:r>
+      <w:proofErr w:type="gramStart"/>
+      <w:r>
+        <w:rPr>
+          <w:rFonts w:ascii="Times New Roman" w:eastAsiaTheme="minorEastAsia" w:hAnsi="Times New Roman" w:cs="Times New Roman"/>
+          <w:color w:val="000000"/>
+        </w:rPr>
+        <w:t>count</w:t>
+      </w:r>
+      <w:proofErr w:type="gramEnd"/>
+      <w:r>
+        <w:rPr>
+          <w:rFonts w:ascii="Times New Roman" w:eastAsiaTheme="minorEastAsia" w:hAnsi="Times New Roman" w:cs="Times New Roman"/>
+          <w:color w:val="000000"/>
+        </w:rPr>
+        <w:t xml:space="preserve"> and localization noise are independent user inputs. We evaluate tracking performance across a range of localization precisions, corresponding to experimental conditions spanning low to high signal-to-noise ratio:</w:t>
       </w:r>
     </w:p>
     <w:p>
@@ -12171,7 +12439,7 @@
         </w:rPr>
         <w:lastRenderedPageBreak/>
         <w:drawing>
-          <wp:inline distT="0" distB="0" distL="0" distR="0" wp14:anchorId="4AC01E61" wp14:editId="35F713ED">
+          <wp:inline distT="0" distB="0" distL="0" distR="0" wp14:anchorId="4AC01E61" wp14:editId="63857713">
             <wp:extent cx="5486400" cy="4170485"/>
             <wp:effectExtent l="0" t="0" r="0" b="1905"/>
             <wp:docPr id="1733207017" name="Picture 1"/>
@@ -12227,7 +12495,25 @@
           <w:color w:val="000000"/>
           <w:sz w:val="20"/>
         </w:rPr>
-        <w:t>Figure A1. Rotational Brownian step on the unit sphere. (A) The dipole orientation μ (blue arrow) lies on the unit sphere S². The orange tangent plane touches S² only at μ and is everywhere perpendicular to μ. Because μ is constrained to unit length, any infinitesimal motion must lie within this plane. (B) Two orthogonal unit vectors e₁ (red) and e₂ (green) span the tangent plane at μ. They are constructed to be perpendicular to μ and to each other, providing two independent local directions in which the orientation can diffuse. (C) Two independent Gaussian samples a₁, a₂ ~ N(0, 2D_(rot)</w:t>
+        <w:t xml:space="preserve">Figure A1. Rotational Brownian step on the unit sphere. (A) The dipole orientation μ (blue arrow) lies on the unit sphere S². The orange tangent plane touches S² only at μ and is everywhere perpendicular to μ. Because μ is constrained to unit length, any infinitesimal motion must lie within this plane. (B) Two orthogonal unit vectors e₁ (red) and e₂ (green) span the tangent plane at μ. They are constructed to be perpendicular to μ and to each other, providing two independent local directions in which the orientation can diffuse. (C) Two independent Gaussian samples a₁, a₂ ~ </w:t>
+      </w:r>
+      <w:proofErr w:type="gramStart"/>
+      <w:r>
+        <w:rPr>
+          <w:rFonts w:ascii="Times New Roman" w:hAnsi="Times New Roman" w:cs="Times New Roman"/>
+          <w:color w:val="000000"/>
+          <w:sz w:val="20"/>
+        </w:rPr>
+        <w:t>N(</w:t>
+      </w:r>
+      <w:proofErr w:type="gramEnd"/>
+      <w:r>
+        <w:rPr>
+          <w:rFonts w:ascii="Times New Roman" w:hAnsi="Times New Roman" w:cs="Times New Roman"/>
+          <w:color w:val="000000"/>
+          <w:sz w:val="20"/>
+        </w:rPr>
+        <w:t>0, 2D_(rot)</w:t>
       </w:r>
       <w:proofErr w:type="spellStart"/>
       <w:r>
@@ -13925,4 +14211,26 @@
     </a:ext>
   </a:extLst>
 </a:theme>
+</file>
+
+<file path=word/webextensions/taskpanes.xml><?xml version="1.0" encoding="utf-8"?>
+<wetp:taskpanes xmlns:wetp="http://schemas.microsoft.com/office/webextensions/taskpanes/2010/11">
+  <wetp:taskpane dockstate="right" visibility="0" width="350" row="2">
+    <wetp:webextensionref xmlns:r="http://schemas.openxmlformats.org/officeDocument/2006/relationships" r:id="rId1"/>
+  </wetp:taskpane>
+</wetp:taskpanes>
+</file>
+
+<file path=word/webextensions/webextension1.xml><?xml version="1.0" encoding="utf-8"?>
+<we:webextension xmlns:we="http://schemas.microsoft.com/office/webextensions/webextension/2010/11" id="{A4383724-CA3C-49A3-8F66-E0A540BAFC53}">
+  <we:reference id="wa200010453" version="1.0.0.1" store="en-US" storeType="OMEX"/>
+  <we:alternateReferences>
+    <we:reference id="WA200010453" version="1.0.0.1" store="" storeType="OMEX"/>
+  </we:alternateReferences>
+  <we:properties>
+    <we:property name="claude.fileId" value="&quot;f634c55c-0d18-4c9f-a7d3-b4d9d6febb0b&quot;"/>
+  </we:properties>
+  <we:bindings/>
+  <we:snapshot xmlns:r="http://schemas.openxmlformats.org/officeDocument/2006/relationships"/>
+</we:webextension>
 </file>
</xml_diff>